<commit_message>
Edit to champion document
</commit_message>
<xml_diff>
--- a/docs/TL1_Dawson/TL1ChampionDocFin.docx
+++ b/docs/TL1_Dawson/TL1ChampionDocFin.docx
@@ -340,14 +340,11 @@
         <w:jc w:val="center"/>
       </w:pPr>
       <w:r>
-        <w:rPr>
-          <w:noProof/>
-        </w:rPr>
         <w:drawing>
-          <wp:inline distT="0" distB="0" distL="0" distR="0" wp14:anchorId="49DFFDF0" wp14:editId="2FB48585">
-            <wp:extent cx="6400800" cy="3636645"/>
-            <wp:effectExtent l="0" t="0" r="0" b="1905"/>
-            <wp:docPr id="1482944514" name="Picture 1"/>
+          <wp:inline distT="0" distB="0" distL="0" distR="0" wp14:anchorId="7BDE6F16" wp14:editId="04246F2F">
+            <wp:extent cx="6400800" cy="3639185"/>
+            <wp:effectExtent l="0" t="0" r="0" b="0"/>
+            <wp:docPr id="1975788631" name="Picture 1"/>
             <wp:cNvGraphicFramePr>
               <a:graphicFrameLocks xmlns:a="http://schemas.openxmlformats.org/drawingml/2006/main" noChangeAspect="1"/>
             </wp:cNvGraphicFramePr>
@@ -355,7 +352,7 @@
               <a:graphicData uri="http://schemas.openxmlformats.org/drawingml/2006/picture">
                 <pic:pic xmlns:pic="http://schemas.openxmlformats.org/drawingml/2006/picture">
                   <pic:nvPicPr>
-                    <pic:cNvPr id="1482944514" name=""/>
+                    <pic:cNvPr id="1975788631" name=""/>
                     <pic:cNvPicPr/>
                   </pic:nvPicPr>
                   <pic:blipFill>
@@ -367,7 +364,7 @@
                   <pic:spPr>
                     <a:xfrm>
                       <a:off x="0" y="0"/>
-                      <a:ext cx="6400800" cy="3636645"/>
+                      <a:ext cx="6400800" cy="3639185"/>
                     </a:xfrm>
                     <a:prstGeom prst="rect">
                       <a:avLst/>
@@ -519,14 +516,11 @@
         <w:jc w:val="center"/>
       </w:pPr>
       <w:r>
-        <w:rPr>
-          <w:noProof/>
-        </w:rPr>
         <w:drawing>
-          <wp:inline distT="0" distB="0" distL="0" distR="0" wp14:anchorId="355F8159" wp14:editId="581007F5">
-            <wp:extent cx="6400800" cy="3636645"/>
-            <wp:effectExtent l="0" t="0" r="0" b="1905"/>
-            <wp:docPr id="258794818" name="Picture 1"/>
+          <wp:inline distT="0" distB="0" distL="0" distR="0" wp14:anchorId="4659EF89" wp14:editId="3FB991CE">
+            <wp:extent cx="6400800" cy="3639185"/>
+            <wp:effectExtent l="0" t="0" r="0" b="0"/>
+            <wp:docPr id="790248561" name="Picture 1"/>
             <wp:cNvGraphicFramePr>
               <a:graphicFrameLocks xmlns:a="http://schemas.openxmlformats.org/drawingml/2006/main" noChangeAspect="1"/>
             </wp:cNvGraphicFramePr>
@@ -534,7 +528,7 @@
               <a:graphicData uri="http://schemas.openxmlformats.org/drawingml/2006/picture">
                 <pic:pic xmlns:pic="http://schemas.openxmlformats.org/drawingml/2006/picture">
                   <pic:nvPicPr>
-                    <pic:cNvPr id="258794818" name=""/>
+                    <pic:cNvPr id="790248561" name=""/>
                     <pic:cNvPicPr/>
                   </pic:nvPicPr>
                   <pic:blipFill>
@@ -546,7 +540,7 @@
                   <pic:spPr>
                     <a:xfrm>
                       <a:off x="0" y="0"/>
-                      <a:ext cx="6400800" cy="3636645"/>
+                      <a:ext cx="6400800" cy="3639185"/>
                     </a:xfrm>
                     <a:prstGeom prst="rect">
                       <a:avLst/>
@@ -899,13 +893,7 @@
         <w:pStyle w:val="Heading1"/>
       </w:pPr>
       <w:r>
-        <w:t>4</w:t>
-      </w:r>
-      <w:r>
-        <w:t xml:space="preserve">. </w:t>
-      </w:r>
-      <w:r>
-        <w:t>Acceptance Tests</w:t>
+        <w:t>4. Acceptance Tests</w:t>
       </w:r>
     </w:p>
     <w:p>
@@ -918,10 +906,7 @@
     </w:p>
     <w:p>
       <w:r>
-        <w:t>O</w:t>
-      </w:r>
-      <w:r>
-        <w:t>ne hundred scripted runs exercise start, active play, win, loss, and reset transitions. Pass requires: 100% of runs reach Running after a valid start, every win/loss transition produces the corresponding GameState, every reset returns the manager to the documented reset state, and 0 invalid transitions are accepted.</w:t>
+        <w:t>One hundred scripted runs exercise start, active play, win, loss, and reset transitions. Pass requires: 100% of runs reach Running after a valid start, every win/loss transition produces the corresponding GameState, every reset returns the manager to the documented reset state, and 0 invalid transitions are accepted.</w:t>
       </w:r>
     </w:p>
     <w:p>
@@ -985,10 +970,7 @@
           <w:p>
             <w:r>
               <w:lastRenderedPageBreak/>
-              <w:t>T</w:t>
-            </w:r>
-            <w:r>
-              <w:t>est</w:t>
+              <w:t>Test</w:t>
             </w:r>
           </w:p>
         </w:tc>
@@ -1989,10 +1971,7 @@
     </w:p>
     <w:p>
       <w:r>
-        <w:t>I drafted</w:t>
-      </w:r>
-      <w:r>
-        <w:t xml:space="preserve"> the full document as specified in class before going in and making revisions. Most edits were in diagrams containing incorrect formatting or incorrect names. I also removed additional elements ChatGPT decided to add that were not in the example document. It contained an extra section specifying data types and variables that </w:t>
+        <w:t xml:space="preserve">I drafted the full document as specified in class before going in and making revisions. Most edits were in diagrams containing incorrect formatting or incorrect names. I also removed additional elements ChatGPT decided to add that were not in the example document. It contained an extra section specifying data types and variables that </w:t>
       </w:r>
       <w:proofErr w:type="gramStart"/>
       <w:r>

</xml_diff>